<commit_message>
wyb adversary-complaint: complete transcription of FILED-EXAMPLE-adversary-complaint (fb-w0vj.1)
fb diff --content: G0 FAIL, exemplar 6 pages, ours 5: the filing puts counsel block, caption and title alone on page 1; the template has no break there. G2 residuals template-driven only.
</commit_message>
<xml_diff>
--- a/courts/tenth-circuit/wyoming/federal/bankruptcy-district/adversary-complaint/usage/OUTPUT-adversary-complaint.docx
+++ b/courts/tenth-circuit/wyoming/federal/bankruptcy-district/adversary-complaint/usage/OUTPUT-adversary-complaint.docx
@@ -260,7 +260,7 @@
               <w:spacing w:before="0" w:after="312" w:line="240" w:lineRule="auto"/>
             </w:pPr>
             <w:r>
-              <w:t xml:space="preserve">Chapter 7</w:t>
+              <w:t xml:space="preserve">(Chapter 7)</w:t>
             </w:r>
           </w:p>
           <w:p>
@@ -540,6 +540,12 @@
       </w:pPr>
       <w:bookmarkStart w:id="13" w:name="_da3538caddd69ca7c226fb43cb5502b03a4449b"/>
       <w:r>
+        <w:rPr>
+          <w:b/>
+          <w:bCs/>
+          <w:i/>
+          <w:iCs/>
+        </w:rPr>
         <w:t xml:space="preserve">(Preference – 11 U.S.C. §547(b))</w:t>
       </w:r>
       <w:bookmarkEnd w:id="13"/>
@@ -624,6 +630,12 @@
       </w:pPr>
       <w:bookmarkStart w:id="15" w:name="_8d3f8d0b15ade7e9007bd094a7b24d84392e54e"/>
       <w:r>
+        <w:rPr>
+          <w:b/>
+          <w:bCs/>
+          <w:i/>
+          <w:iCs/>
+        </w:rPr>
         <w:t xml:space="preserve">(Recovery of Avoided Preferential Transfer – 11 U.S.C. §§ 550 and 551)</w:t>
       </w:r>
       <w:bookmarkEnd w:id="15"/>

</xml_diff>